<commit_message>
Avance:casi todo falta corregir errores y  bugs 2
</commit_message>
<xml_diff>
--- a/backend/temas_archivos/examen_6/aritmetica/aritmetica_pregunta_1.docx
+++ b/backend/temas_archivos/examen_6/aritmetica/aritmetica_pregunta_1.docx
@@ -1,369 +1,369 @@
 
 <file path=word/document.xml><?xml version="1.0" encoding="utf-8"?>
-<ns0:document xmlns:ns0="http://schemas.openxmlformats.org/wordprocessingml/2006/main" xmlns:ns1="http://schemas.openxmlformats.org/markup-compatibility/2006" xmlns:ns2="http://schemas.microsoft.com/office/word/2010/wordml" xmlns:ns3="http://schemas.openxmlformats.org/officeDocument/2006/math" xmlns:ns4="http://schemas.openxmlformats.org/officeDocument/2006/relationships" ns1:Ignorable="w14 w15 w16se w16cid w16 w16cex w16sdtdh w16sdtfl w16du wp14">
-  <ns0:body>
-    <ns0:p ns2:paraId="1A8D92EF" ns2:textId="77777777">
-      <ns0:pPr>
-        <ns0:pStyle ns0:val="Prrafodelista"/>
-        <ns0:numPr>
-          <ns0:ilvl ns0:val="0"/>
-          <ns0:numId ns0:val="1"/>
-        </ns0:numPr>
-        <ns0:jc ns0:val="both"/>
-        <ns0:rPr>
-          <ns0:rFonts ns0:ascii="Times New Roman" ns0:hAnsi="Times New Roman" ns0:cs="Times New Roman"/>
-          <ns0:color ns0:val="0D0D0D" ns0:themeColor="text1" ns0:themeTint="F2"/>
-          <ns0:sz ns0:val="24"/>
-          <ns0:szCs ns0:val="24"/>
-        </ns0:rPr>
-      </ns0:pPr>
-      <ns0:r>
-        <ns0:rPr>
-          <ns0:rFonts ns0:ascii="Times New Roman" ns0:hAnsi="Times New Roman" ns0:cs="Times New Roman"/>
-          <ns0:color ns0:val="0D0D0D" ns0:themeColor="text1" ns0:themeTint="F2"/>
-          <ns0:sz ns0:val="24"/>
-          <ns0:szCs ns0:val="24"/>
-        </ns0:rPr>
-        <ns0:t xml:space="preserve">Silvia llega tarde al cine cuando había pasado </ns0:t>
-      </ns0:r>
-      <ns3:oMath>
-        <ns3:f>
-          <ns3:fPr>
-            <ns3:ctrlPr>
-              <ns0:rPr>
-                <ns0:rFonts ns0:ascii="Cambria Math" ns0:hAnsi="Cambria Math" ns0:cs="Times New Roman"/>
-                <ns0:color ns0:val="0D0D0D" ns0:themeColor="text1" ns0:themeTint="F2"/>
-                <ns0:sz ns0:val="24"/>
-                <ns0:szCs ns0:val="24"/>
-              </ns0:rPr>
-            </ns3:ctrlPr>
-          </ns3:fPr>
-          <ns3:num>
-            <ns3:r>
-              <ns0:rPr>
-                <ns0:rFonts ns0:ascii="Cambria Math" ns0:hAnsi="Cambria Math" ns0:cs="Times New Roman"/>
-                <ns0:color ns0:val="0D0D0D" ns0:themeColor="text1" ns0:themeTint="F2"/>
-                <ns0:sz ns0:val="24"/>
-                <ns0:szCs ns0:val="24"/>
-              </ns0:rPr>
-              <ns3:t>1</ns3:t>
-            </ns3:r>
-          </ns3:num>
-          <ns3:den>
-            <ns3:r>
-              <ns0:rPr>
-                <ns0:rFonts ns0:ascii="Cambria Math" ns0:hAnsi="Cambria Math" ns0:cs="Times New Roman"/>
-                <ns0:color ns0:val="0D0D0D" ns0:themeColor="text1" ns0:themeTint="F2"/>
-                <ns0:sz ns0:val="24"/>
-                <ns0:szCs ns0:val="24"/>
-              </ns0:rPr>
-              <ns3:t>8</ns3:t>
-            </ns3:r>
-          </ns3:den>
-        </ns3:f>
-      </ns3:oMath>
-      <ns0:r>
-        <ns0:rPr>
-          <ns0:rFonts ns0:ascii="Times New Roman" ns0:hAnsi="Times New Roman" ns0:cs="Times New Roman"/>
-          <ns0:color ns0:val="0D0D0D" ns0:themeColor="text1" ns0:themeTint="F2"/>
-          <ns0:sz ns0:val="24"/>
-          <ns0:szCs ns0:val="24"/>
-        </ns0:rPr>
-        <ns0:t xml:space="preserve"> de la película, 6 minutos después llega Roxana y sólo ve los </ns0:t>
-      </ns0:r>
-      <ns3:oMath>
-        <ns3:f>
-          <ns3:fPr>
-            <ns3:ctrlPr>
-              <ns0:rPr>
-                <ns0:rFonts ns0:ascii="Cambria Math" ns0:hAnsi="Cambria Math" ns0:cs="Times New Roman"/>
-                <ns0:color ns0:val="0D0D0D" ns0:themeColor="text1" ns0:themeTint="F2"/>
-                <ns0:sz ns0:val="24"/>
-                <ns0:szCs ns0:val="24"/>
-              </ns0:rPr>
-            </ns3:ctrlPr>
-          </ns3:fPr>
-          <ns3:num>
-            <ns3:r>
-              <ns0:rPr>
-                <ns0:rFonts ns0:ascii="Cambria Math" ns0:hAnsi="Cambria Math" ns0:cs="Times New Roman"/>
-                <ns0:color ns0:val="0D0D0D" ns0:themeColor="text1" ns0:themeTint="F2"/>
-                <ns0:sz ns0:val="24"/>
-                <ns0:szCs ns0:val="24"/>
-              </ns0:rPr>
-              <ns3:t>4</ns3:t>
-            </ns3:r>
-          </ns3:num>
-          <ns3:den>
-            <ns3:r>
-              <ns0:rPr>
-                <ns0:rFonts ns0:ascii="Cambria Math" ns0:hAnsi="Cambria Math" ns0:cs="Times New Roman"/>
-                <ns0:color ns0:val="0D0D0D" ns0:themeColor="text1" ns0:themeTint="F2"/>
-                <ns0:sz ns0:val="24"/>
-                <ns0:szCs ns0:val="24"/>
-              </ns0:rPr>
-              <ns3:t>5</ns3:t>
-            </ns3:r>
-          </ns3:den>
-        </ns3:f>
-      </ns3:oMath>
-      <ns0:r>
-        <ns0:rPr>
-          <ns0:rFonts ns0:ascii="Times New Roman" ns0:hAnsi="Times New Roman" ns0:cs="Times New Roman"/>
-          <ns0:color ns0:val="0D0D0D" ns0:themeColor="text1" ns0:themeTint="F2"/>
-          <ns0:sz ns0:val="24"/>
-          <ns0:szCs ns0:val="24"/>
-        </ns0:rPr>
-        <ns0:t xml:space="preserve"> . Si la película empieza a las 16:00 </ns0:t>
-      </ns0:r>
-      <ns0:r>
-        <ns0:rPr>
-          <ns0:rFonts ns0:ascii="Times New Roman" ns0:hAnsi="Times New Roman" ns0:cs="Times New Roman"/>
-          <ns0:color ns0:val="0D0D0D" ns0:themeColor="text1" ns0:themeTint="F2"/>
-          <ns0:sz ns0:val="24"/>
-          <ns0:szCs ns0:val="24"/>
-        </ns0:rPr>
-        <ns0:t>pm</ns0:t>
-      </ns0:r>
-      <ns0:r>
-        <ns0:rPr>
-          <ns0:rFonts ns0:ascii="Times New Roman" ns0:hAnsi="Times New Roman" ns0:cs="Times New Roman"/>
-          <ns0:color ns0:val="0D0D0D" ns0:themeColor="text1" ns0:themeTint="F2"/>
-          <ns0:sz ns0:val="24"/>
-          <ns0:szCs ns0:val="24"/>
-        </ns0:rPr>
-        <ns0:t xml:space="preserve"> ¿</ns0:t>
-      </ns0:r>
-      <ns0:r>
-        <ns0:rPr>
-          <ns0:rFonts ns0:ascii="Times New Roman" ns0:hAnsi="Times New Roman" ns0:cs="Times New Roman"/>
-          <ns0:color ns0:val="0D0D0D" ns0:themeColor="text1" ns0:themeTint="F2"/>
-          <ns0:sz ns0:val="24"/>
-          <ns0:szCs ns0:val="24"/>
-        </ns0:rPr>
-        <ns0:t>a</ns0:t>
-      </ns0:r>
-      <ns0:r>
-        <ns0:rPr>
-          <ns0:rFonts ns0:ascii="Times New Roman" ns0:hAnsi="Times New Roman" ns0:cs="Times New Roman"/>
-          <ns0:color ns0:val="0D0D0D" ns0:themeColor="text1" ns0:themeTint="F2"/>
-          <ns0:sz ns0:val="24"/>
-          <ns0:szCs ns0:val="24"/>
-        </ns0:rPr>
-        <ns0:t xml:space="preserve"> qué hora termina?</ns0:t>
-      </ns0:r>
-    </ns0:p>
-    <ns0:p ns2:paraId="444A8981" ns2:textId="77777777">
-      <ns0:pPr>
-        <ns0:pStyle ns0:val="Prrafodelista"/>
-        <ns0:rPr>
-          <ns0:rFonts ns0:ascii="Times New Roman" ns0:hAnsi="Times New Roman" ns0:cs="Times New Roman"/>
-          <ns0:color ns0:val="0D0D0D" ns0:themeColor="text1" ns0:themeTint="F2"/>
-          <ns0:sz ns0:val="24"/>
-          <ns0:szCs ns0:val="24"/>
-        </ns0:rPr>
-      </ns0:pPr>
-    </ns0:p>
-    <ns0:p ns2:paraId="7A89F9EB" ns2:textId="77777777">
-      <ns0:pPr>
-        <ns0:pStyle ns0:val="Prrafodelista"/>
-        <ns0:numPr>
-          <ns0:ilvl ns0:val="0"/>
-          <ns0:numId ns0:val="2"/>
-        </ns0:numPr>
-        <ns0:rPr>
-          <ns0:rFonts ns0:ascii="Times New Roman" ns0:hAnsi="Times New Roman" ns0:cs="Times New Roman"/>
-          <ns0:color ns0:val="0D0D0D" ns0:themeColor="text1" ns0:themeTint="F2"/>
-          <ns0:sz ns0:val="24"/>
-          <ns0:szCs ns0:val="24"/>
-          <ns0:highlight ns0:val="yellow"/>
-        </ns0:rPr>
-      </ns0:pPr>
-      <ns0:r>
-        <ns0:rPr>
-          <ns0:rFonts ns0:ascii="Times New Roman" ns0:hAnsi="Times New Roman" ns0:cs="Times New Roman"/>
-          <ns0:color ns0:val="0D0D0D" ns0:themeColor="text1" ns0:themeTint="F2"/>
-          <ns0:sz ns0:val="24"/>
-          <ns0:szCs ns0:val="24"/>
-          <ns0:highlight ns0:val="yellow"/>
-        </ns0:rPr>
-        <ns0:t xml:space="preserve">15:20 </ns0:t>
-      </ns0:r>
-      <ns0:r>
-        <ns0:rPr>
-          <ns0:rFonts ns0:ascii="Times New Roman" ns0:hAnsi="Times New Roman" ns0:cs="Times New Roman"/>
-          <ns0:color ns0:val="0D0D0D" ns0:themeColor="text1" ns0:themeTint="F2"/>
-          <ns0:sz ns0:val="24"/>
-          <ns0:szCs ns0:val="24"/>
-          <ns0:highlight ns0:val="yellow"/>
-        </ns0:rPr>
-        <ns0:t>p.m.</ns0:t>
-      </ns0:r>
-    </ns0:p>
-    <ns0:p ns2:paraId="1A45A755" ns2:textId="77777777">
-      <ns0:pPr>
-        <ns0:pStyle ns0:val="Prrafodelista"/>
-        <ns0:numPr>
-          <ns0:ilvl ns0:val="0"/>
-          <ns0:numId ns0:val="2"/>
-        </ns0:numPr>
-        <ns0:rPr>
-          <ns0:rFonts ns0:ascii="Times New Roman" ns0:hAnsi="Times New Roman" ns0:cs="Times New Roman"/>
-          <ns0:color ns0:val="0D0D0D" ns0:themeColor="text1" ns0:themeTint="F2"/>
-          <ns0:sz ns0:val="24"/>
-          <ns0:szCs ns0:val="24"/>
-        </ns0:rPr>
-      </ns0:pPr>
-      <ns0:r>
-        <ns0:rPr>
-          <ns0:rFonts ns0:ascii="Times New Roman" ns0:hAnsi="Times New Roman" ns0:cs="Times New Roman"/>
-          <ns0:color ns0:val="0D0D0D" ns0:themeColor="text1" ns0:themeTint="F2"/>
-          <ns0:sz ns0:val="24"/>
-          <ns0:szCs ns0:val="24"/>
-        </ns0:rPr>
-        <ns0:t>17:</ns0:t>
-      </ns0:r>
-      <ns0:r>
-        <ns0:rPr>
-          <ns0:rFonts ns0:ascii="Times New Roman" ns0:hAnsi="Times New Roman" ns0:cs="Times New Roman"/>
-          <ns0:color ns0:val="0D0D0D" ns0:themeColor="text1" ns0:themeTint="F2"/>
-          <ns0:sz ns0:val="24"/>
-          <ns0:szCs ns0:val="24"/>
-        </ns0:rPr>
-        <ns0:t>25</ns0:t>
-      </ns0:r>
-      <ns0:r>
-        <ns0:rPr>
-          <ns0:rFonts ns0:ascii="Times New Roman" ns0:hAnsi="Times New Roman" ns0:cs="Times New Roman"/>
-          <ns0:color ns0:val="0D0D0D" ns0:themeColor="text1" ns0:themeTint="F2"/>
-          <ns0:sz ns0:val="24"/>
-          <ns0:szCs ns0:val="24"/>
-        </ns0:rPr>
-        <ns0:t xml:space="preserve"> p.m.</ns0:t>
-      </ns0:r>
-    </ns0:p>
-    <ns0:p ns2:paraId="7D311E33" ns2:textId="77777777">
-      <ns0:pPr>
-        <ns0:pStyle ns0:val="Prrafodelista"/>
-        <ns0:numPr>
-          <ns0:ilvl ns0:val="0"/>
-          <ns0:numId ns0:val="2"/>
-        </ns0:numPr>
-        <ns0:rPr>
-          <ns0:rFonts ns0:ascii="Times New Roman" ns0:hAnsi="Times New Roman" ns0:cs="Times New Roman"/>
-          <ns0:color ns0:val="0D0D0D" ns0:themeColor="text1" ns0:themeTint="F2"/>
-          <ns0:sz ns0:val="24"/>
-          <ns0:szCs ns0:val="24"/>
-        </ns0:rPr>
-      </ns0:pPr>
-      <ns0:r>
-        <ns0:rPr>
-          <ns0:rFonts ns0:ascii="Times New Roman" ns0:hAnsi="Times New Roman" ns0:cs="Times New Roman"/>
-          <ns0:color ns0:val="0D0D0D" ns0:themeColor="text1" ns0:themeTint="F2"/>
-          <ns0:sz ns0:val="24"/>
-          <ns0:szCs ns0:val="24"/>
-        </ns0:rPr>
-        <ns0:t>17:30</ns0:t>
-      </ns0:r>
-      <ns0:r>
-        <ns0:rPr>
-          <ns0:rFonts ns0:ascii="Times New Roman" ns0:hAnsi="Times New Roman" ns0:cs="Times New Roman"/>
-          <ns0:color ns0:val="0D0D0D" ns0:themeColor="text1" ns0:themeTint="F2"/>
-          <ns0:sz ns0:val="24"/>
-          <ns0:szCs ns0:val="24"/>
-        </ns0:rPr>
-        <ns0:t xml:space="preserve"> p.m.</ns0:t>
-      </ns0:r>
-    </ns0:p>
-    <ns0:p ns2:paraId="60607ED0" ns2:textId="77777777">
-      <ns0:pPr>
-        <ns0:pStyle ns0:val="Prrafodelista"/>
-        <ns0:numPr>
-          <ns0:ilvl ns0:val="0"/>
-          <ns0:numId ns0:val="2"/>
-        </ns0:numPr>
-        <ns0:rPr>
-          <ns0:rFonts ns0:ascii="Times New Roman" ns0:hAnsi="Times New Roman" ns0:cs="Times New Roman"/>
-          <ns0:color ns0:val="0D0D0D" ns0:themeColor="text1" ns0:themeTint="F2"/>
-          <ns0:sz ns0:val="24"/>
-          <ns0:szCs ns0:val="24"/>
-        </ns0:rPr>
-      </ns0:pPr>
-      <ns0:r>
-        <ns0:rPr>
-          <ns0:rFonts ns0:ascii="Times New Roman" ns0:hAnsi="Times New Roman" ns0:cs="Times New Roman"/>
-          <ns0:color ns0:val="0D0D0D" ns0:themeColor="text1" ns0:themeTint="F2"/>
-          <ns0:sz ns0:val="24"/>
-          <ns0:szCs ns0:val="24"/>
-        </ns0:rPr>
-        <ns0:t xml:space="preserve">17:35 </ns0:t>
-      </ns0:r>
-      <ns0:r>
-        <ns0:rPr>
-          <ns0:rFonts ns0:ascii="Times New Roman" ns0:hAnsi="Times New Roman" ns0:cs="Times New Roman"/>
-          <ns0:color ns0:val="0D0D0D" ns0:themeColor="text1" ns0:themeTint="F2"/>
-          <ns0:sz ns0:val="24"/>
-          <ns0:szCs ns0:val="24"/>
-        </ns0:rPr>
-        <ns0:t>p.m.</ns0:t>
-      </ns0:r>
-    </ns0:p>
-    <ns0:p ns2:paraId="70EDEE2A" ns2:textId="77777777">
-      <ns0:pPr>
-        <ns0:pStyle ns0:val="Prrafodelista"/>
-        <ns0:numPr>
-          <ns0:ilvl ns0:val="0"/>
-          <ns0:numId ns0:val="2"/>
-        </ns0:numPr>
-        <ns0:rPr>
-          <ns0:rFonts ns0:ascii="Times New Roman" ns0:hAnsi="Times New Roman" ns0:cs="Times New Roman"/>
-          <ns0:color ns0:val="0D0D0D" ns0:themeColor="text1" ns0:themeTint="F2"/>
-          <ns0:sz ns0:val="24"/>
-          <ns0:szCs ns0:val="24"/>
-        </ns0:rPr>
-      </ns0:pPr>
-      <ns0:r>
-        <ns0:rPr>
-          <ns0:rFonts ns0:ascii="Times New Roman" ns0:hAnsi="Times New Roman" ns0:cs="Times New Roman"/>
-          <ns0:color ns0:val="0D0D0D" ns0:themeColor="text1" ns0:themeTint="F2"/>
-          <ns0:sz ns0:val="24"/>
-          <ns0:szCs ns0:val="24"/>
-        </ns0:rPr>
-        <ns0:t>14:40</ns0:t>
-      </ns0:r>
-      <ns0:r>
-        <ns0:rPr>
-          <ns0:rFonts ns0:ascii="Times New Roman" ns0:hAnsi="Times New Roman" ns0:cs="Times New Roman"/>
-          <ns0:color ns0:val="0D0D0D" ns0:themeColor="text1" ns0:themeTint="F2"/>
-          <ns0:sz ns0:val="24"/>
-          <ns0:szCs ns0:val="24"/>
-        </ns0:rPr>
-        <ns0:t xml:space="preserve"> p.m.</ns0:t>
-      </ns0:r>
-    </ns0:p>
-    <ns0:p ns2:paraId="72D6C414" ns2:textId="77777777">
-      <ns0:pPr>
-        <ns0:pStyle ns0:val="Prrafodelista"/>
-        <ns0:ind ns0:left="1080"/>
-        <ns0:rPr>
-          <ns0:rFonts ns0:ascii="Times New Roman" ns0:hAnsi="Times New Roman" ns0:cs="Times New Roman"/>
-          <ns0:color ns0:val="0D0D0D" ns0:themeColor="text1" ns0:themeTint="F2"/>
-          <ns0:sz ns0:val="24"/>
-          <ns0:szCs ns0:val="24"/>
-        </ns0:rPr>
-      </ns0:pPr>
-    </ns0:p>
-    <ns0:p/>
-    <ns0:sectPr ns0:rsidR="006C372E" ns0:rsidRPr="00751676" ns0:rsidSect="00544F5E">
-      <ns0:headerReference ns0:type="default" ns4:id="rId19"/>
-      <ns0:footerReference ns0:type="default" ns4:id="rId20"/>
-      <ns0:pgSz ns0:w="12242" ns0:h="18722"/>
-      <ns0:pgMar ns0:top="1134" ns0:right="1134" ns0:bottom="1134" ns0:left="1134" ns0:header="709" ns0:footer="709" ns0:gutter="0"/>
-      <ns0:cols ns0:space="708"/>
-      <ns0:docGrid ns0:linePitch="360"/>
-    </ns0:sectPr>
-  </ns0:body>
-</ns0:document>
+<w:document xmlns:m="http://schemas.openxmlformats.org/officeDocument/2006/math" xmlns:mc="http://schemas.openxmlformats.org/markup-compatibility/2006" xmlns:ns2="http://schemas.microsoft.com/office/word/2010/wordml" xmlns:r="http://schemas.openxmlformats.org/officeDocument/2006/relationships" xmlns:w="http://schemas.openxmlformats.org/wordprocessingml/2006/main" mc:Ignorable="w14 w15 w16se w16cid w16 w16cex w16sdtdh w16sdtfl w16du wp14">
+  <w:body>
+    <w:p ns2:paraId="1A8D92EF" ns2:textId="77777777">
+      <w:pPr>
+        <w:pStyle w:val="Prrafodelista"/>
+        <w:numPr>
+          <w:ilvl w:val="0"/>
+          <w:numId w:val="1"/>
+        </w:numPr>
+        <w:jc w:val="both"/>
+        <w:rPr>
+          <w:rFonts w:ascii="Times New Roman" w:hAnsi="Times New Roman" w:cs="Times New Roman"/>
+          <w:color w:val="0D0D0D" w:themeColor="text1" w:themeTint="F2"/>
+          <w:sz w:val="24"/>
+          <w:szCs w:val="24"/>
+        </w:rPr>
+      </w:pPr>
+      <w:r>
+        <w:rPr>
+          <w:rFonts w:ascii="Times New Roman" w:hAnsi="Times New Roman" w:cs="Times New Roman"/>
+          <w:color w:val="0D0D0D" w:themeColor="text1" w:themeTint="F2"/>
+          <w:sz w:val="24"/>
+          <w:szCs w:val="24"/>
+        </w:rPr>
+        <w:t xml:space="preserve">Silvia llega tarde al cine cuando había pasado </w:t>
+      </w:r>
+      <m:oMath>
+        <m:f>
+          <m:fPr>
+            <m:ctrlPr>
+              <w:rPr>
+                <w:rFonts w:ascii="Cambria Math" w:hAnsi="Cambria Math" w:cs="Times New Roman"/>
+                <w:color w:val="0D0D0D" w:themeColor="text1" w:themeTint="F2"/>
+                <w:sz w:val="24"/>
+                <w:szCs w:val="24"/>
+              </w:rPr>
+            </m:ctrlPr>
+          </m:fPr>
+          <m:num>
+            <m:r>
+              <w:rPr>
+                <w:rFonts w:ascii="Cambria Math" w:hAnsi="Cambria Math" w:cs="Times New Roman"/>
+                <w:color w:val="0D0D0D" w:themeColor="text1" w:themeTint="F2"/>
+                <w:sz w:val="24"/>
+                <w:szCs w:val="24"/>
+              </w:rPr>
+              <m:t>1</m:t>
+            </m:r>
+          </m:num>
+          <m:den>
+            <m:r>
+              <w:rPr>
+                <w:rFonts w:ascii="Cambria Math" w:hAnsi="Cambria Math" w:cs="Times New Roman"/>
+                <w:color w:val="0D0D0D" w:themeColor="text1" w:themeTint="F2"/>
+                <w:sz w:val="24"/>
+                <w:szCs w:val="24"/>
+              </w:rPr>
+              <m:t>8</m:t>
+            </m:r>
+          </m:den>
+        </m:f>
+      </m:oMath>
+      <w:r>
+        <w:rPr>
+          <w:rFonts w:ascii="Times New Roman" w:hAnsi="Times New Roman" w:cs="Times New Roman"/>
+          <w:color w:val="0D0D0D" w:themeColor="text1" w:themeTint="F2"/>
+          <w:sz w:val="24"/>
+          <w:szCs w:val="24"/>
+        </w:rPr>
+        <w:t xml:space="preserve"> de la película, 6 minutos después llega Roxana y sólo ve los </w:t>
+      </w:r>
+      <m:oMath>
+        <m:f>
+          <m:fPr>
+            <m:ctrlPr>
+              <w:rPr>
+                <w:rFonts w:ascii="Cambria Math" w:hAnsi="Cambria Math" w:cs="Times New Roman"/>
+                <w:color w:val="0D0D0D" w:themeColor="text1" w:themeTint="F2"/>
+                <w:sz w:val="24"/>
+                <w:szCs w:val="24"/>
+              </w:rPr>
+            </m:ctrlPr>
+          </m:fPr>
+          <m:num>
+            <m:r>
+              <w:rPr>
+                <w:rFonts w:ascii="Cambria Math" w:hAnsi="Cambria Math" w:cs="Times New Roman"/>
+                <w:color w:val="0D0D0D" w:themeColor="text1" w:themeTint="F2"/>
+                <w:sz w:val="24"/>
+                <w:szCs w:val="24"/>
+              </w:rPr>
+              <m:t>4</m:t>
+            </m:r>
+          </m:num>
+          <m:den>
+            <m:r>
+              <w:rPr>
+                <w:rFonts w:ascii="Cambria Math" w:hAnsi="Cambria Math" w:cs="Times New Roman"/>
+                <w:color w:val="0D0D0D" w:themeColor="text1" w:themeTint="F2"/>
+                <w:sz w:val="24"/>
+                <w:szCs w:val="24"/>
+              </w:rPr>
+              <m:t>5</m:t>
+            </m:r>
+          </m:den>
+        </m:f>
+      </m:oMath>
+      <w:r>
+        <w:rPr>
+          <w:rFonts w:ascii="Times New Roman" w:hAnsi="Times New Roman" w:cs="Times New Roman"/>
+          <w:color w:val="0D0D0D" w:themeColor="text1" w:themeTint="F2"/>
+          <w:sz w:val="24"/>
+          <w:szCs w:val="24"/>
+        </w:rPr>
+        <w:t xml:space="preserve"> . Si la película empieza a las 16:00 </w:t>
+      </w:r>
+      <w:r>
+        <w:rPr>
+          <w:rFonts w:ascii="Times New Roman" w:hAnsi="Times New Roman" w:cs="Times New Roman"/>
+          <w:color w:val="0D0D0D" w:themeColor="text1" w:themeTint="F2"/>
+          <w:sz w:val="24"/>
+          <w:szCs w:val="24"/>
+        </w:rPr>
+        <w:t>pm</w:t>
+      </w:r>
+      <w:r>
+        <w:rPr>
+          <w:rFonts w:ascii="Times New Roman" w:hAnsi="Times New Roman" w:cs="Times New Roman"/>
+          <w:color w:val="0D0D0D" w:themeColor="text1" w:themeTint="F2"/>
+          <w:sz w:val="24"/>
+          <w:szCs w:val="24"/>
+        </w:rPr>
+        <w:t xml:space="preserve"> ¿</w:t>
+      </w:r>
+      <w:r>
+        <w:rPr>
+          <w:rFonts w:ascii="Times New Roman" w:hAnsi="Times New Roman" w:cs="Times New Roman"/>
+          <w:color w:val="0D0D0D" w:themeColor="text1" w:themeTint="F2"/>
+          <w:sz w:val="24"/>
+          <w:szCs w:val="24"/>
+        </w:rPr>
+        <w:t>a</w:t>
+      </w:r>
+      <w:r>
+        <w:rPr>
+          <w:rFonts w:ascii="Times New Roman" w:hAnsi="Times New Roman" w:cs="Times New Roman"/>
+          <w:color w:val="0D0D0D" w:themeColor="text1" w:themeTint="F2"/>
+          <w:sz w:val="24"/>
+          <w:szCs w:val="24"/>
+        </w:rPr>
+        <w:t xml:space="preserve"> qué hora termina?</w:t>
+      </w:r>
+    </w:p>
+    <w:p ns2:paraId="444A8981" ns2:textId="77777777">
+      <w:pPr>
+        <w:pStyle w:val="Prrafodelista"/>
+        <w:rPr>
+          <w:rFonts w:ascii="Times New Roman" w:hAnsi="Times New Roman" w:cs="Times New Roman"/>
+          <w:color w:val="0D0D0D" w:themeColor="text1" w:themeTint="F2"/>
+          <w:sz w:val="24"/>
+          <w:szCs w:val="24"/>
+        </w:rPr>
+      </w:pPr>
+    </w:p>
+    <w:p ns2:paraId="7A89F9EB" ns2:textId="77777777">
+      <w:pPr>
+        <w:pStyle w:val="Prrafodelista"/>
+        <w:numPr>
+          <w:ilvl w:val="0"/>
+          <w:numId w:val="2"/>
+        </w:numPr>
+        <w:rPr>
+          <w:rFonts w:ascii="Times New Roman" w:hAnsi="Times New Roman" w:cs="Times New Roman"/>
+          <w:color w:val="0D0D0D" w:themeColor="text1" w:themeTint="F2"/>
+          <w:sz w:val="24"/>
+          <w:szCs w:val="24"/>
+          <w:highlight w:val="yellow"/>
+        </w:rPr>
+      </w:pPr>
+      <w:r>
+        <w:rPr>
+          <w:rFonts w:ascii="Times New Roman" w:hAnsi="Times New Roman" w:cs="Times New Roman"/>
+          <w:color w:val="0D0D0D" w:themeColor="text1" w:themeTint="F2"/>
+          <w:sz w:val="24"/>
+          <w:szCs w:val="24"/>
+          <w:highlight w:val="yellow"/>
+        </w:rPr>
+        <w:t xml:space="preserve">15:20 </w:t>
+      </w:r>
+      <w:r>
+        <w:rPr>
+          <w:rFonts w:ascii="Times New Roman" w:hAnsi="Times New Roman" w:cs="Times New Roman"/>
+          <w:color w:val="0D0D0D" w:themeColor="text1" w:themeTint="F2"/>
+          <w:sz w:val="24"/>
+          <w:szCs w:val="24"/>
+          <w:highlight w:val="yellow"/>
+        </w:rPr>
+        <w:t>p.m.</w:t>
+      </w:r>
+    </w:p>
+    <w:p ns2:paraId="1A45A755" ns2:textId="77777777">
+      <w:pPr>
+        <w:pStyle w:val="Prrafodelista"/>
+        <w:numPr>
+          <w:ilvl w:val="0"/>
+          <w:numId w:val="2"/>
+        </w:numPr>
+        <w:rPr>
+          <w:rFonts w:ascii="Times New Roman" w:hAnsi="Times New Roman" w:cs="Times New Roman"/>
+          <w:color w:val="0D0D0D" w:themeColor="text1" w:themeTint="F2"/>
+          <w:sz w:val="24"/>
+          <w:szCs w:val="24"/>
+        </w:rPr>
+      </w:pPr>
+      <w:r>
+        <w:rPr>
+          <w:rFonts w:ascii="Times New Roman" w:hAnsi="Times New Roman" w:cs="Times New Roman"/>
+          <w:color w:val="0D0D0D" w:themeColor="text1" w:themeTint="F2"/>
+          <w:sz w:val="24"/>
+          <w:szCs w:val="24"/>
+        </w:rPr>
+        <w:t>17:</w:t>
+      </w:r>
+      <w:r>
+        <w:rPr>
+          <w:rFonts w:ascii="Times New Roman" w:hAnsi="Times New Roman" w:cs="Times New Roman"/>
+          <w:color w:val="0D0D0D" w:themeColor="text1" w:themeTint="F2"/>
+          <w:sz w:val="24"/>
+          <w:szCs w:val="24"/>
+        </w:rPr>
+        <w:t>25</w:t>
+      </w:r>
+      <w:r>
+        <w:rPr>
+          <w:rFonts w:ascii="Times New Roman" w:hAnsi="Times New Roman" w:cs="Times New Roman"/>
+          <w:color w:val="0D0D0D" w:themeColor="text1" w:themeTint="F2"/>
+          <w:sz w:val="24"/>
+          <w:szCs w:val="24"/>
+        </w:rPr>
+        <w:t xml:space="preserve"> p.m.</w:t>
+      </w:r>
+    </w:p>
+    <w:p ns2:paraId="7D311E33" ns2:textId="77777777">
+      <w:pPr>
+        <w:pStyle w:val="Prrafodelista"/>
+        <w:numPr>
+          <w:ilvl w:val="0"/>
+          <w:numId w:val="2"/>
+        </w:numPr>
+        <w:rPr>
+          <w:rFonts w:ascii="Times New Roman" w:hAnsi="Times New Roman" w:cs="Times New Roman"/>
+          <w:color w:val="0D0D0D" w:themeColor="text1" w:themeTint="F2"/>
+          <w:sz w:val="24"/>
+          <w:szCs w:val="24"/>
+        </w:rPr>
+      </w:pPr>
+      <w:r>
+        <w:rPr>
+          <w:rFonts w:ascii="Times New Roman" w:hAnsi="Times New Roman" w:cs="Times New Roman"/>
+          <w:color w:val="0D0D0D" w:themeColor="text1" w:themeTint="F2"/>
+          <w:sz w:val="24"/>
+          <w:szCs w:val="24"/>
+        </w:rPr>
+        <w:t>17:30</w:t>
+      </w:r>
+      <w:r>
+        <w:rPr>
+          <w:rFonts w:ascii="Times New Roman" w:hAnsi="Times New Roman" w:cs="Times New Roman"/>
+          <w:color w:val="0D0D0D" w:themeColor="text1" w:themeTint="F2"/>
+          <w:sz w:val="24"/>
+          <w:szCs w:val="24"/>
+        </w:rPr>
+        <w:t xml:space="preserve"> p.m.</w:t>
+      </w:r>
+    </w:p>
+    <w:p ns2:paraId="60607ED0" ns2:textId="77777777">
+      <w:pPr>
+        <w:pStyle w:val="Prrafodelista"/>
+        <w:numPr>
+          <w:ilvl w:val="0"/>
+          <w:numId w:val="2"/>
+        </w:numPr>
+        <w:rPr>
+          <w:rFonts w:ascii="Times New Roman" w:hAnsi="Times New Roman" w:cs="Times New Roman"/>
+          <w:color w:val="0D0D0D" w:themeColor="text1" w:themeTint="F2"/>
+          <w:sz w:val="24"/>
+          <w:szCs w:val="24"/>
+        </w:rPr>
+      </w:pPr>
+      <w:r>
+        <w:rPr>
+          <w:rFonts w:ascii="Times New Roman" w:hAnsi="Times New Roman" w:cs="Times New Roman"/>
+          <w:color w:val="0D0D0D" w:themeColor="text1" w:themeTint="F2"/>
+          <w:sz w:val="24"/>
+          <w:szCs w:val="24"/>
+        </w:rPr>
+        <w:t xml:space="preserve">17:35 </w:t>
+      </w:r>
+      <w:r>
+        <w:rPr>
+          <w:rFonts w:ascii="Times New Roman" w:hAnsi="Times New Roman" w:cs="Times New Roman"/>
+          <w:color w:val="0D0D0D" w:themeColor="text1" w:themeTint="F2"/>
+          <w:sz w:val="24"/>
+          <w:szCs w:val="24"/>
+        </w:rPr>
+        <w:t>p.m.</w:t>
+      </w:r>
+    </w:p>
+    <w:p ns2:paraId="70EDEE2A" ns2:textId="77777777">
+      <w:pPr>
+        <w:pStyle w:val="Prrafodelista"/>
+        <w:numPr>
+          <w:ilvl w:val="0"/>
+          <w:numId w:val="2"/>
+        </w:numPr>
+        <w:rPr>
+          <w:rFonts w:ascii="Times New Roman" w:hAnsi="Times New Roman" w:cs="Times New Roman"/>
+          <w:color w:val="0D0D0D" w:themeColor="text1" w:themeTint="F2"/>
+          <w:sz w:val="24"/>
+          <w:szCs w:val="24"/>
+        </w:rPr>
+      </w:pPr>
+      <w:r>
+        <w:rPr>
+          <w:rFonts w:ascii="Times New Roman" w:hAnsi="Times New Roman" w:cs="Times New Roman"/>
+          <w:color w:val="0D0D0D" w:themeColor="text1" w:themeTint="F2"/>
+          <w:sz w:val="24"/>
+          <w:szCs w:val="24"/>
+        </w:rPr>
+        <w:t>14:40</w:t>
+      </w:r>
+      <w:r>
+        <w:rPr>
+          <w:rFonts w:ascii="Times New Roman" w:hAnsi="Times New Roman" w:cs="Times New Roman"/>
+          <w:color w:val="0D0D0D" w:themeColor="text1" w:themeTint="F2"/>
+          <w:sz w:val="24"/>
+          <w:szCs w:val="24"/>
+        </w:rPr>
+        <w:t xml:space="preserve"> p.m.</w:t>
+      </w:r>
+    </w:p>
+    <w:p ns2:paraId="72D6C414" ns2:textId="77777777">
+      <w:pPr>
+        <w:pStyle w:val="Prrafodelista"/>
+        <w:ind w:left="1080"/>
+        <w:rPr>
+          <w:rFonts w:ascii="Times New Roman" w:hAnsi="Times New Roman" w:cs="Times New Roman"/>
+          <w:color w:val="0D0D0D" w:themeColor="text1" w:themeTint="F2"/>
+          <w:sz w:val="24"/>
+          <w:szCs w:val="24"/>
+        </w:rPr>
+      </w:pPr>
+    </w:p>
+    <w:p/>
+    <w:sectPr>
+      <w:headerReference w:type="default" r:id="rId19"/>
+      <w:footerReference w:type="default" r:id="rId20"/>
+      <w:pgSz w:w="12242" w:h="18722"/>
+      <w:pgMar w:top="1134" w:right="1134" w:bottom="1134" w:left="1134" w:header="709" w:footer="709" w:gutter="0"/>
+      <w:cols w:space="708"/>
+      <w:docGrid w:linePitch="360"/>
+    </w:sectPr>
+  </w:body>
+</w:document>
 </file>
 
 <file path=word/endnotes.xml><?xml version="1.0" encoding="utf-8"?>

</xml_diff>